<commit_message>
Complete end-to-end investigation integration
</commit_message>
<xml_diff>
--- a/docs/Contributions.docx
+++ b/docs/Contributions.docx
@@ -55,20 +55,7 @@
         <w:spacing w:after="60"/>
       </w:pPr>
       <w:r>
-        <w:rPr>
-          <w:rFonts w:ascii="Calibri" w:hAnsi="Calibri"/>
-          <w:b/>
-          <w:color w:val="1F4D78"/>
-          <w:sz w:val="20"/>
-        </w:rPr>
-        <w:t xml:space="preserve">History reviewed through: </w:t>
-      </w:r>
-      <w:r>
-        <w:rPr>
-          <w:rFonts w:ascii="Calibri" w:hAnsi="Calibri"/>
-          <w:sz w:val="20"/>
-        </w:rPr>
-        <w:t>Commit 256afa2 (15 August 2026)</w:t>
+        <w:t>History reviewed through: Working tree based on commit d66a0ac (15 August 2026)</w:t>
       </w:r>
     </w:p>
     <w:p>
@@ -76,20 +63,7 @@
         <w:spacing w:before="200" w:after="160"/>
       </w:pPr>
       <w:r>
-        <w:rPr>
-          <w:rFonts w:ascii="Calibri" w:hAnsi="Calibri"/>
-          <w:b/>
-          <w:color w:val="1F4D78"/>
-          <w:sz w:val="21"/>
-        </w:rPr>
-        <w:t xml:space="preserve">Record scope. </w:t>
-      </w:r>
-      <w:r>
-        <w:rPr>
-          <w:rFonts w:ascii="Calibri" w:hAnsi="Calibri"/>
-          <w:sz w:val="21"/>
-        </w:rPr>
-        <w:t>This document summarizes project contributions recorded in the repository through commit 256afa2. Merge commits are not repeated as separate feature contributions.</w:t>
+        <w:t>Record scope. This document summarizes project contributions recorded in the repository through commit d66a0ac and the subsequent Phase 1-3 integration work present in the working tree on 15 August 2026. Merge commits are not repeated as separate feature contributions.</w:t>
       </w:r>
     </w:p>
     <w:p>
@@ -291,20 +265,7 @@
         <w:ind w:left="540" w:hanging="271"/>
       </w:pPr>
       <w:r>
-        <w:rPr>
-          <w:rFonts w:ascii="Calibri" w:hAnsi="Calibri"/>
-          <w:b/>
-          <w:color w:val="0B2545"/>
-          <w:sz w:val="22"/>
-        </w:rPr>
-        <w:t>Frontend data contracts and mocks</w:t>
-      </w:r>
-      <w:r>
-        <w:rPr>
-          <w:rFonts w:ascii="Calibri" w:hAnsi="Calibri"/>
-          <w:sz w:val="22"/>
-        </w:rPr>
-        <w:t xml:space="preserve"> — Defined frontend domain types, structured mock datasets, assistant fixtures, and tests for UI behavior while backend APIs remain incomplete.</w:t>
+        <w:t>Frontend contracts and adapter boundaries - Defined shared frontend domain types, centralized API behavior, generated OpenAPI DTOs, deterministic mock adapters, connected adapters, and explicit test/demo configuration without automatic mock fallback.</w:t>
       </w:r>
     </w:p>
     <w:p>
@@ -466,6 +427,62 @@
           <w:sz w:val="22"/>
         </w:rPr>
         <w:t xml:space="preserve"> — Managed merges, synchronized J3DI and main, and published the consolidated documentation and planning updates.</w:t>
+      </w:r>
+    </w:p>
+    <w:p>
+      <w:pPr>
+        <w:pStyle w:val="ListBullet"/>
+      </w:pPr>
+      <w:r>
+        <w:t>Phase 1 evidence-import foundation - Replaced the static import demonstration with an accessible CSV/JSON intake workflow, explicit mock capability labeling, 50 MiB client validation, keyboard and drag/drop selection, reducer-controlled states, cancellation/retry behavior, and focused component/unit coverage.</w:t>
+      </w:r>
+    </w:p>
+    <w:p>
+      <w:pPr>
+        <w:pStyle w:val="ListBullet"/>
+      </w:pPr>
+      <w:r>
+        <w:t>Phase 2 persisted batch investigation - Built the FastAPI/SQLite case, import, evidence, event, analysis, dashboard, pagination, filtering, duplicate, partial-approval, cancellation, immutable evidence, job recovery, and deterministic reanalysis APIs and connected the frontend journey end to end.</w:t>
+      </w:r>
+    </w:p>
+    <w:p>
+      <w:pPr>
+        <w:pStyle w:val="ListBullet"/>
+      </w:pPr>
+      <w:r>
+        <w:t>Primary dataset integration - Added canonical CASAS and TON_IoT telemetry profiles, fixtures, provenance documentation, normalization paths, source-aligned frontend choices, and secondary compatibility boundaries for TON_IoT network and CICIoT data.</w:t>
+      </w:r>
+    </w:p>
+    <w:p>
+      <w:pPr>
+        <w:pStyle w:val="ListBullet"/>
+      </w:pPr>
+      <w:r>
+        <w:t>OpenAPI and shared frontend integration - Added deterministic OpenAPI export and drift testing, generated TypeScript contracts, centralized fetch/error/query/request-ID behavior, transport-neutral data sources, shared investigation view models, and API-backed case, evidence, analysis, timeline, graph, analytics, and overview screens.</w:t>
+      </w:r>
+    </w:p>
+    <w:p>
+      <w:pPr>
+        <w:pStyle w:val="ListBullet"/>
+      </w:pPr>
+      <w:r>
+        <w:t>Phase 3 live operations and grounded assistance - Implemented authenticated HTTP telemetry, durable live sessions and receipts, bounded workers, SSE replay/reconnect/deduplication, device state, a controlled telemetry simulator, persisted assistant sessions, bounded retrieval, validated citations, safe visualization specifications, offline handling, and deterministic fallbacks.</w:t>
+      </w:r>
+    </w:p>
+    <w:p>
+      <w:pPr>
+        <w:pStyle w:val="ListBullet"/>
+      </w:pPr>
+      <w:r>
+        <w:t>Controlled reports, delivery, and audit - Implemented deterministic PDF reports, immutable versions and hashes, approval invalidation, approval-gated email drafts and SMTP sending, recipient allow-lists, delivery-unknown handling, and persisted audit history.</w:t>
+      </w:r>
+    </w:p>
+    <w:p>
+      <w:pPr>
+        <w:pStyle w:val="ListBullet"/>
+      </w:pPr>
+      <w:r>
+        <w:t>Frontend checklist completion and verification - Audited every checklist requirement, corrected stale mock claims, added rejection-reference and partial-result presentations, enforced the frontend forensic boundary, documented completion evidence, and passed 43 frontend tests, 60 backend tests, TypeScript/lint, production build, and OpenAPI drift gates.</w:t>
       </w:r>
     </w:p>
     <w:p>
@@ -925,20 +942,7 @@
         <w:ind w:left="540" w:hanging="271"/>
       </w:pPr>
       <w:r>
-        <w:rPr>
-          <w:rFonts w:ascii="Calibri" w:hAnsi="Calibri"/>
-          <w:b/>
-          <w:color w:val="0B2545"/>
-          <w:sz w:val="22"/>
-        </w:rPr>
-        <w:t>J3DI</w:t>
-      </w:r>
-      <w:r>
-        <w:rPr>
-          <w:rFonts w:ascii="Calibri" w:hAnsi="Calibri"/>
-          <w:sz w:val="22"/>
-        </w:rPr>
-        <w:t>: Completed roadmap Steps 1 and 2 and established the project's core technical and frontend foundations. Additional recorded work includes project and synopsis documentation, frontend architecture and investigation interfaces, visual and accessibility refinements, dataset-scope corrections, pretesting and integration planning, and branch integration and release coordination.</w:t>
+        <w:t>J3DI: Established the project's core technical and frontend foundations, then completed the three-phase frontend integration: truthful evidence intake, persisted batch investigation, authenticated live operations, grounded assistance, approval-gated reporting and email delivery, and final checklist verification. Additional recorded work includes project and synopsis documentation, frontend architecture, visual and accessibility refinements, dataset-scope corrections, contract generation, operational documentation, and branch integration and release coordination.</w:t>
       </w:r>
     </w:p>
     <w:p>

</xml_diff>